<commit_message>
got the beetle and Hemiptera pictures up
I did the Beetles first and then I just  reused the same tags and filled in the info to retrieved the Hemiptera pics
</commit_message>
<xml_diff>
--- a/Assigment 2/inft1206_assignment2.docx
+++ b/Assigment 2/inft1206_assignment2.docx
@@ -1,6 +1,6 @@
 
 <file path=word/document.xml><?xml version="1.0" encoding="utf-8"?>
-<w:document xmlns:wpc="http://schemas.microsoft.com/office/word/2010/wordprocessingCanvas" xmlns:cx="http://schemas.microsoft.com/office/drawing/2014/chartex" xmlns:cx1="http://schemas.microsoft.com/office/drawing/2015/9/8/chartex" xmlns:cx2="http://schemas.microsoft.com/office/drawing/2015/10/21/chartex" xmlns:cx3="http://schemas.microsoft.com/office/drawing/2016/5/9/chartex" xmlns:cx4="http://schemas.microsoft.com/office/drawing/2016/5/10/chartex" xmlns:cx5="http://schemas.microsoft.com/office/drawing/2016/5/11/chartex" xmlns:cx6="http://schemas.microsoft.com/office/drawing/2016/5/12/chartex" xmlns:cx7="http://schemas.microsoft.com/office/drawing/2016/5/13/chartex" xmlns:cx8="http://schemas.microsoft.com/office/drawing/2016/5/14/chartex" xmlns:mc="http://schemas.openxmlformats.org/markup-compatibility/2006" xmlns:aink="http://schemas.microsoft.com/office/drawing/2016/ink" xmlns:am3d="http://schemas.microsoft.com/office/drawing/2017/model3d" xmlns:o="urn:schemas-microsoft-com:office:office" xmlns:r="http://schemas.openxmlformats.org/officeDocument/2006/relationships" xmlns:m="http://schemas.openxmlformats.org/officeDocument/2006/math" xmlns:v="urn:schemas-microsoft-com:vml" xmlns:wp14="http://schemas.microsoft.com/office/word/2010/wordprocessingDrawing" xmlns:wp="http://schemas.openxmlformats.org/drawingml/2006/wordprocessingDrawing" xmlns:w10="urn:schemas-microsoft-com:office:word" xmlns:w="http://schemas.openxmlformats.org/wordprocessingml/2006/main" xmlns:w14="http://schemas.microsoft.com/office/word/2010/wordml" xmlns:w15="http://schemas.microsoft.com/office/word/2012/wordml" xmlns:w16cid="http://schemas.microsoft.com/office/word/2016/wordml/cid" xmlns:w16se="http://schemas.microsoft.com/office/word/2015/wordml/symex" xmlns:wpg="http://schemas.microsoft.com/office/word/2010/wordprocessingGroup" xmlns:wpi="http://schemas.microsoft.com/office/word/2010/wordprocessingInk" xmlns:wne="http://schemas.microsoft.com/office/word/2006/wordml" xmlns:wps="http://schemas.microsoft.com/office/word/2010/wordprocessingShape" mc:Ignorable="w14 w15 w16se w16cid wp14">
+<w:document xmlns:wpc="http://schemas.microsoft.com/office/word/2010/wordprocessingCanvas" xmlns:cx="http://schemas.microsoft.com/office/drawing/2014/chartex" xmlns:cx1="http://schemas.microsoft.com/office/drawing/2015/9/8/chartex" xmlns:cx2="http://schemas.microsoft.com/office/drawing/2015/10/21/chartex" xmlns:cx3="http://schemas.microsoft.com/office/drawing/2016/5/9/chartex" xmlns:cx4="http://schemas.microsoft.com/office/drawing/2016/5/10/chartex" xmlns:cx5="http://schemas.microsoft.com/office/drawing/2016/5/11/chartex" xmlns:cx6="http://schemas.microsoft.com/office/drawing/2016/5/12/chartex" xmlns:cx7="http://schemas.microsoft.com/office/drawing/2016/5/13/chartex" xmlns:cx8="http://schemas.microsoft.com/office/drawing/2016/5/14/chartex" xmlns:mc="http://schemas.openxmlformats.org/markup-compatibility/2006" xmlns:aink="http://schemas.microsoft.com/office/drawing/2016/ink" xmlns:am3d="http://schemas.microsoft.com/office/drawing/2017/model3d" xmlns:o="urn:schemas-microsoft-com:office:office" xmlns:oel="http://schemas.microsoft.com/office/2019/extlst" xmlns:r="http://schemas.openxmlformats.org/officeDocument/2006/relationships" xmlns:m="http://schemas.openxmlformats.org/officeDocument/2006/math" xmlns:v="urn:schemas-microsoft-com:vml" xmlns:wp14="http://schemas.microsoft.com/office/word/2010/wordprocessingDrawing" xmlns:wp="http://schemas.openxmlformats.org/drawingml/2006/wordprocessingDrawing" xmlns:w10="urn:schemas-microsoft-com:office:word" xmlns:w="http://schemas.openxmlformats.org/wordprocessingml/2006/main" xmlns:w14="http://schemas.microsoft.com/office/word/2010/wordml" xmlns:w15="http://schemas.microsoft.com/office/word/2012/wordml" xmlns:w16cex="http://schemas.microsoft.com/office/word/2018/wordml/cex" xmlns:w16cid="http://schemas.microsoft.com/office/word/2016/wordml/cid" xmlns:w16="http://schemas.microsoft.com/office/word/2018/wordml" xmlns:w16du="http://schemas.microsoft.com/office/word/2023/wordml/word16du" xmlns:w16sdtdh="http://schemas.microsoft.com/office/word/2020/wordml/sdtdatahash" xmlns:w16sdtfl="http://schemas.microsoft.com/office/word/2024/wordml/sdtformatlock" xmlns:w16se="http://schemas.microsoft.com/office/word/2015/wordml/symex" xmlns:wpg="http://schemas.microsoft.com/office/word/2010/wordprocessingGroup" xmlns:wpi="http://schemas.microsoft.com/office/word/2010/wordprocessingInk" xmlns:wne="http://schemas.microsoft.com/office/word/2006/wordml" xmlns:wps="http://schemas.microsoft.com/office/word/2010/wordprocessingShape" mc:Ignorable="w14 w15 w16se w16cid w16 w16cex w16sdtdh w16sdtfl w16du wp14">
   <w:body>
     <w:p>
       <w:pPr>
@@ -175,8 +175,13 @@
     <w:p/>
     <w:p>
       <w:r>
-        <w:t>For each and every</w:t>
-      </w:r>
+        <w:t xml:space="preserve">For </w:t>
+      </w:r>
+      <w:proofErr w:type="gramStart"/>
+      <w:r>
+        <w:t>each and every</w:t>
+      </w:r>
+      <w:proofErr w:type="gramEnd"/>
       <w:r>
         <w:t xml:space="preserve"> *.html</w:t>
       </w:r>
@@ -685,7 +690,7 @@
           <w:lang w:eastAsia="en-CA"/>
         </w:rPr>
         <w:br/>
-        <w:t xml:space="preserve">&lt;html </w:t>
+        <w:t>&lt;html lang="</w:t>
       </w:r>
       <w:proofErr w:type="spellStart"/>
       <w:r>
@@ -695,7 +700,7 @@
           <w:szCs w:val="20"/>
           <w:lang w:eastAsia="en-CA"/>
         </w:rPr>
-        <w:t>lang</w:t>
+        <w:t>en</w:t>
       </w:r>
       <w:proofErr w:type="spellEnd"/>
       <w:r>
@@ -705,9 +710,8 @@
           <w:szCs w:val="20"/>
           <w:lang w:eastAsia="en-CA"/>
         </w:rPr>
-        <w:t>="</w:t>
-      </w:r>
-      <w:proofErr w:type="spellStart"/>
+        <w:t>"&gt;</w:t>
+      </w:r>
       <w:r>
         <w:rPr>
           <w:rFonts w:ascii="Courier New" w:eastAsia="Times New Roman" w:hAnsi="Courier New" w:cs="Courier New"/>
@@ -715,9 +719,9 @@
           <w:szCs w:val="20"/>
           <w:lang w:eastAsia="en-CA"/>
         </w:rPr>
-        <w:t>en</w:t>
-      </w:r>
-      <w:proofErr w:type="spellEnd"/>
+        <w:br/>
+        <w:t>&lt;head&gt;</w:t>
+      </w:r>
       <w:r>
         <w:rPr>
           <w:rFonts w:ascii="Courier New" w:eastAsia="Times New Roman" w:hAnsi="Courier New" w:cs="Courier New"/>
@@ -725,25 +729,6 @@
           <w:szCs w:val="20"/>
           <w:lang w:eastAsia="en-CA"/>
         </w:rPr>
-        <w:t>"&gt;</w:t>
-      </w:r>
-      <w:r>
-        <w:rPr>
-          <w:rFonts w:ascii="Courier New" w:eastAsia="Times New Roman" w:hAnsi="Courier New" w:cs="Courier New"/>
-          <w:sz w:val="20"/>
-          <w:szCs w:val="20"/>
-          <w:lang w:eastAsia="en-CA"/>
-        </w:rPr>
-        <w:br/>
-        <w:t>&lt;head&gt;</w:t>
-      </w:r>
-      <w:r>
-        <w:rPr>
-          <w:rFonts w:ascii="Courier New" w:eastAsia="Times New Roman" w:hAnsi="Courier New" w:cs="Courier New"/>
-          <w:sz w:val="20"/>
-          <w:szCs w:val="20"/>
-          <w:lang w:eastAsia="en-CA"/>
-        </w:rPr>
         <w:br/>
         <w:t>    &lt;meta charset="utf-8"&gt;</w:t>
       </w:r>
@@ -758,8 +743,6 @@
       <w:pPr>
         <w:pStyle w:val="Heading1"/>
       </w:pPr>
-      <w:bookmarkStart w:id="1" w:name="_GoBack"/>
-      <w:bookmarkEnd w:id="1"/>
       <w:r>
         <w:t>GitHub Requirements</w:t>
       </w:r>
@@ -967,7 +950,7 @@
         </w:numPr>
         <w:ind w:left="1777"/>
       </w:pPr>
-      <w:bookmarkStart w:id="2" w:name="_Hlk143852887"/>
+      <w:bookmarkStart w:id="1" w:name="_Hlk143852887"/>
       <w:r>
         <w:rPr>
           <w:rFonts w:ascii="Verdana" w:hAnsi="Verdana"/>
@@ -1021,7 +1004,7 @@
         <w:t>Work through the exercises, ensuring that the GitHub, HTML Comments and submission requirements are met.</w:t>
       </w:r>
     </w:p>
-    <w:bookmarkEnd w:id="2"/>
+    <w:bookmarkEnd w:id="1"/>
     <w:p>
       <w:pPr>
         <w:pStyle w:val="Heading2"/>
@@ -1111,7 +1094,7 @@
 </file>
 
 <file path=word/endnotes.xml><?xml version="1.0" encoding="utf-8"?>
-<w:endnotes xmlns:wpc="http://schemas.microsoft.com/office/word/2010/wordprocessingCanvas" xmlns:cx="http://schemas.microsoft.com/office/drawing/2014/chartex" xmlns:cx1="http://schemas.microsoft.com/office/drawing/2015/9/8/chartex" xmlns:cx2="http://schemas.microsoft.com/office/drawing/2015/10/21/chartex" xmlns:cx3="http://schemas.microsoft.com/office/drawing/2016/5/9/chartex" xmlns:cx4="http://schemas.microsoft.com/office/drawing/2016/5/10/chartex" xmlns:cx5="http://schemas.microsoft.com/office/drawing/2016/5/11/chartex" xmlns:cx6="http://schemas.microsoft.com/office/drawing/2016/5/12/chartex" xmlns:cx7="http://schemas.microsoft.com/office/drawing/2016/5/13/chartex" xmlns:cx8="http://schemas.microsoft.com/office/drawing/2016/5/14/chartex" xmlns:mc="http://schemas.openxmlformats.org/markup-compatibility/2006" xmlns:aink="http://schemas.microsoft.com/office/drawing/2016/ink" xmlns:am3d="http://schemas.microsoft.com/office/drawing/2017/model3d" xmlns:o="urn:schemas-microsoft-com:office:office" xmlns:r="http://schemas.openxmlformats.org/officeDocument/2006/relationships" xmlns:m="http://schemas.openxmlformats.org/officeDocument/2006/math" xmlns:v="urn:schemas-microsoft-com:vml" xmlns:wp14="http://schemas.microsoft.com/office/word/2010/wordprocessingDrawing" xmlns:wp="http://schemas.openxmlformats.org/drawingml/2006/wordprocessingDrawing" xmlns:w10="urn:schemas-microsoft-com:office:word" xmlns:w="http://schemas.openxmlformats.org/wordprocessingml/2006/main" xmlns:w14="http://schemas.microsoft.com/office/word/2010/wordml" xmlns:w15="http://schemas.microsoft.com/office/word/2012/wordml" xmlns:w16cid="http://schemas.microsoft.com/office/word/2016/wordml/cid" xmlns:w16se="http://schemas.microsoft.com/office/word/2015/wordml/symex" xmlns:wpg="http://schemas.microsoft.com/office/word/2010/wordprocessingGroup" xmlns:wpi="http://schemas.microsoft.com/office/word/2010/wordprocessingInk" xmlns:wne="http://schemas.microsoft.com/office/word/2006/wordml" xmlns:wps="http://schemas.microsoft.com/office/word/2010/wordprocessingShape" mc:Ignorable="w14 w15 w16se w16cid wp14">
+<w:endnotes xmlns:wpc="http://schemas.microsoft.com/office/word/2010/wordprocessingCanvas" xmlns:cx="http://schemas.microsoft.com/office/drawing/2014/chartex" xmlns:cx1="http://schemas.microsoft.com/office/drawing/2015/9/8/chartex" xmlns:cx2="http://schemas.microsoft.com/office/drawing/2015/10/21/chartex" xmlns:cx3="http://schemas.microsoft.com/office/drawing/2016/5/9/chartex" xmlns:cx4="http://schemas.microsoft.com/office/drawing/2016/5/10/chartex" xmlns:cx5="http://schemas.microsoft.com/office/drawing/2016/5/11/chartex" xmlns:cx6="http://schemas.microsoft.com/office/drawing/2016/5/12/chartex" xmlns:cx7="http://schemas.microsoft.com/office/drawing/2016/5/13/chartex" xmlns:cx8="http://schemas.microsoft.com/office/drawing/2016/5/14/chartex" xmlns:mc="http://schemas.openxmlformats.org/markup-compatibility/2006" xmlns:aink="http://schemas.microsoft.com/office/drawing/2016/ink" xmlns:am3d="http://schemas.microsoft.com/office/drawing/2017/model3d" xmlns:o="urn:schemas-microsoft-com:office:office" xmlns:oel="http://schemas.microsoft.com/office/2019/extlst" xmlns:r="http://schemas.openxmlformats.org/officeDocument/2006/relationships" xmlns:m="http://schemas.openxmlformats.org/officeDocument/2006/math" xmlns:v="urn:schemas-microsoft-com:vml" xmlns:wp14="http://schemas.microsoft.com/office/word/2010/wordprocessingDrawing" xmlns:wp="http://schemas.openxmlformats.org/drawingml/2006/wordprocessingDrawing" xmlns:w10="urn:schemas-microsoft-com:office:word" xmlns:w="http://schemas.openxmlformats.org/wordprocessingml/2006/main" xmlns:w14="http://schemas.microsoft.com/office/word/2010/wordml" xmlns:w15="http://schemas.microsoft.com/office/word/2012/wordml" xmlns:w16cex="http://schemas.microsoft.com/office/word/2018/wordml/cex" xmlns:w16cid="http://schemas.microsoft.com/office/word/2016/wordml/cid" xmlns:w16="http://schemas.microsoft.com/office/word/2018/wordml" xmlns:w16du="http://schemas.microsoft.com/office/word/2023/wordml/word16du" xmlns:w16sdtdh="http://schemas.microsoft.com/office/word/2020/wordml/sdtdatahash" xmlns:w16sdtfl="http://schemas.microsoft.com/office/word/2024/wordml/sdtformatlock" xmlns:w16se="http://schemas.microsoft.com/office/word/2015/wordml/symex" xmlns:wpg="http://schemas.microsoft.com/office/word/2010/wordprocessingGroup" xmlns:wpi="http://schemas.microsoft.com/office/word/2010/wordprocessingInk" xmlns:wne="http://schemas.microsoft.com/office/word/2006/wordml" xmlns:wps="http://schemas.microsoft.com/office/word/2010/wordprocessingShape" mc:Ignorable="w14 w15 w16se w16cid w16 w16cex w16sdtdh w16sdtfl w16du wp14">
   <w:endnote w:type="separator" w:id="-1">
     <w:p>
       <w:pPr>
@@ -1136,7 +1119,7 @@
 </file>
 
 <file path=word/footer1.xml><?xml version="1.0" encoding="utf-8"?>
-<w:ftr xmlns:wpc="http://schemas.microsoft.com/office/word/2010/wordprocessingCanvas" xmlns:cx="http://schemas.microsoft.com/office/drawing/2014/chartex" xmlns:cx1="http://schemas.microsoft.com/office/drawing/2015/9/8/chartex" xmlns:cx2="http://schemas.microsoft.com/office/drawing/2015/10/21/chartex" xmlns:cx3="http://schemas.microsoft.com/office/drawing/2016/5/9/chartex" xmlns:cx4="http://schemas.microsoft.com/office/drawing/2016/5/10/chartex" xmlns:cx5="http://schemas.microsoft.com/office/drawing/2016/5/11/chartex" xmlns:cx6="http://schemas.microsoft.com/office/drawing/2016/5/12/chartex" xmlns:cx7="http://schemas.microsoft.com/office/drawing/2016/5/13/chartex" xmlns:cx8="http://schemas.microsoft.com/office/drawing/2016/5/14/chartex" xmlns:mc="http://schemas.openxmlformats.org/markup-compatibility/2006" xmlns:aink="http://schemas.microsoft.com/office/drawing/2016/ink" xmlns:am3d="http://schemas.microsoft.com/office/drawing/2017/model3d" xmlns:o="urn:schemas-microsoft-com:office:office" xmlns:r="http://schemas.openxmlformats.org/officeDocument/2006/relationships" xmlns:m="http://schemas.openxmlformats.org/officeDocument/2006/math" xmlns:v="urn:schemas-microsoft-com:vml" xmlns:wp14="http://schemas.microsoft.com/office/word/2010/wordprocessingDrawing" xmlns:wp="http://schemas.openxmlformats.org/drawingml/2006/wordprocessingDrawing" xmlns:w10="urn:schemas-microsoft-com:office:word" xmlns:w="http://schemas.openxmlformats.org/wordprocessingml/2006/main" xmlns:w14="http://schemas.microsoft.com/office/word/2010/wordml" xmlns:w15="http://schemas.microsoft.com/office/word/2012/wordml" xmlns:w16cid="http://schemas.microsoft.com/office/word/2016/wordml/cid" xmlns:w16se="http://schemas.microsoft.com/office/word/2015/wordml/symex" xmlns:wpg="http://schemas.microsoft.com/office/word/2010/wordprocessingGroup" xmlns:wpi="http://schemas.microsoft.com/office/word/2010/wordprocessingInk" xmlns:wne="http://schemas.microsoft.com/office/word/2006/wordml" xmlns:wps="http://schemas.microsoft.com/office/word/2010/wordprocessingShape" mc:Ignorable="w14 w15 w16se w16cid wp14">
+<w:ftr xmlns:wpc="http://schemas.microsoft.com/office/word/2010/wordprocessingCanvas" xmlns:cx="http://schemas.microsoft.com/office/drawing/2014/chartex" xmlns:cx1="http://schemas.microsoft.com/office/drawing/2015/9/8/chartex" xmlns:cx2="http://schemas.microsoft.com/office/drawing/2015/10/21/chartex" xmlns:cx3="http://schemas.microsoft.com/office/drawing/2016/5/9/chartex" xmlns:cx4="http://schemas.microsoft.com/office/drawing/2016/5/10/chartex" xmlns:cx5="http://schemas.microsoft.com/office/drawing/2016/5/11/chartex" xmlns:cx6="http://schemas.microsoft.com/office/drawing/2016/5/12/chartex" xmlns:cx7="http://schemas.microsoft.com/office/drawing/2016/5/13/chartex" xmlns:cx8="http://schemas.microsoft.com/office/drawing/2016/5/14/chartex" xmlns:mc="http://schemas.openxmlformats.org/markup-compatibility/2006" xmlns:aink="http://schemas.microsoft.com/office/drawing/2016/ink" xmlns:am3d="http://schemas.microsoft.com/office/drawing/2017/model3d" xmlns:o="urn:schemas-microsoft-com:office:office" xmlns:oel="http://schemas.microsoft.com/office/2019/extlst" xmlns:r="http://schemas.openxmlformats.org/officeDocument/2006/relationships" xmlns:m="http://schemas.openxmlformats.org/officeDocument/2006/math" xmlns:v="urn:schemas-microsoft-com:vml" xmlns:wp14="http://schemas.microsoft.com/office/word/2010/wordprocessingDrawing" xmlns:wp="http://schemas.openxmlformats.org/drawingml/2006/wordprocessingDrawing" xmlns:w10="urn:schemas-microsoft-com:office:word" xmlns:w="http://schemas.openxmlformats.org/wordprocessingml/2006/main" xmlns:w14="http://schemas.microsoft.com/office/word/2010/wordml" xmlns:w15="http://schemas.microsoft.com/office/word/2012/wordml" xmlns:w16cex="http://schemas.microsoft.com/office/word/2018/wordml/cex" xmlns:w16cid="http://schemas.microsoft.com/office/word/2016/wordml/cid" xmlns:w16="http://schemas.microsoft.com/office/word/2018/wordml" xmlns:w16du="http://schemas.microsoft.com/office/word/2023/wordml/word16du" xmlns:w16sdtdh="http://schemas.microsoft.com/office/word/2020/wordml/sdtdatahash" xmlns:w16sdtfl="http://schemas.microsoft.com/office/word/2024/wordml/sdtformatlock" xmlns:w16se="http://schemas.microsoft.com/office/word/2015/wordml/symex" xmlns:wpg="http://schemas.microsoft.com/office/word/2010/wordprocessingGroup" xmlns:wpi="http://schemas.microsoft.com/office/word/2010/wordprocessingInk" xmlns:wne="http://schemas.microsoft.com/office/word/2006/wordml" xmlns:wps="http://schemas.microsoft.com/office/word/2010/wordprocessingShape" mc:Ignorable="w14 w15 w16se w16cid w16 w16cex w16sdtdh w16sdtfl w16du wp14">
   <w:p>
     <w:pPr>
       <w:pStyle w:val="Footer"/>
@@ -1154,7 +1137,7 @@
 </file>
 
 <file path=word/footnotes.xml><?xml version="1.0" encoding="utf-8"?>
-<w:footnotes xmlns:wpc="http://schemas.microsoft.com/office/word/2010/wordprocessingCanvas" xmlns:cx="http://schemas.microsoft.com/office/drawing/2014/chartex" xmlns:cx1="http://schemas.microsoft.com/office/drawing/2015/9/8/chartex" xmlns:cx2="http://schemas.microsoft.com/office/drawing/2015/10/21/chartex" xmlns:cx3="http://schemas.microsoft.com/office/drawing/2016/5/9/chartex" xmlns:cx4="http://schemas.microsoft.com/office/drawing/2016/5/10/chartex" xmlns:cx5="http://schemas.microsoft.com/office/drawing/2016/5/11/chartex" xmlns:cx6="http://schemas.microsoft.com/office/drawing/2016/5/12/chartex" xmlns:cx7="http://schemas.microsoft.com/office/drawing/2016/5/13/chartex" xmlns:cx8="http://schemas.microsoft.com/office/drawing/2016/5/14/chartex" xmlns:mc="http://schemas.openxmlformats.org/markup-compatibility/2006" xmlns:aink="http://schemas.microsoft.com/office/drawing/2016/ink" xmlns:am3d="http://schemas.microsoft.com/office/drawing/2017/model3d" xmlns:o="urn:schemas-microsoft-com:office:office" xmlns:r="http://schemas.openxmlformats.org/officeDocument/2006/relationships" xmlns:m="http://schemas.openxmlformats.org/officeDocument/2006/math" xmlns:v="urn:schemas-microsoft-com:vml" xmlns:wp14="http://schemas.microsoft.com/office/word/2010/wordprocessingDrawing" xmlns:wp="http://schemas.openxmlformats.org/drawingml/2006/wordprocessingDrawing" xmlns:w10="urn:schemas-microsoft-com:office:word" xmlns:w="http://schemas.openxmlformats.org/wordprocessingml/2006/main" xmlns:w14="http://schemas.microsoft.com/office/word/2010/wordml" xmlns:w15="http://schemas.microsoft.com/office/word/2012/wordml" xmlns:w16cid="http://schemas.microsoft.com/office/word/2016/wordml/cid" xmlns:w16se="http://schemas.microsoft.com/office/word/2015/wordml/symex" xmlns:wpg="http://schemas.microsoft.com/office/word/2010/wordprocessingGroup" xmlns:wpi="http://schemas.microsoft.com/office/word/2010/wordprocessingInk" xmlns:wne="http://schemas.microsoft.com/office/word/2006/wordml" xmlns:wps="http://schemas.microsoft.com/office/word/2010/wordprocessingShape" mc:Ignorable="w14 w15 w16se w16cid wp14">
+<w:footnotes xmlns:wpc="http://schemas.microsoft.com/office/word/2010/wordprocessingCanvas" xmlns:cx="http://schemas.microsoft.com/office/drawing/2014/chartex" xmlns:cx1="http://schemas.microsoft.com/office/drawing/2015/9/8/chartex" xmlns:cx2="http://schemas.microsoft.com/office/drawing/2015/10/21/chartex" xmlns:cx3="http://schemas.microsoft.com/office/drawing/2016/5/9/chartex" xmlns:cx4="http://schemas.microsoft.com/office/drawing/2016/5/10/chartex" xmlns:cx5="http://schemas.microsoft.com/office/drawing/2016/5/11/chartex" xmlns:cx6="http://schemas.microsoft.com/office/drawing/2016/5/12/chartex" xmlns:cx7="http://schemas.microsoft.com/office/drawing/2016/5/13/chartex" xmlns:cx8="http://schemas.microsoft.com/office/drawing/2016/5/14/chartex" xmlns:mc="http://schemas.openxmlformats.org/markup-compatibility/2006" xmlns:aink="http://schemas.microsoft.com/office/drawing/2016/ink" xmlns:am3d="http://schemas.microsoft.com/office/drawing/2017/model3d" xmlns:o="urn:schemas-microsoft-com:office:office" xmlns:oel="http://schemas.microsoft.com/office/2019/extlst" xmlns:r="http://schemas.openxmlformats.org/officeDocument/2006/relationships" xmlns:m="http://schemas.openxmlformats.org/officeDocument/2006/math" xmlns:v="urn:schemas-microsoft-com:vml" xmlns:wp14="http://schemas.microsoft.com/office/word/2010/wordprocessingDrawing" xmlns:wp="http://schemas.openxmlformats.org/drawingml/2006/wordprocessingDrawing" xmlns:w10="urn:schemas-microsoft-com:office:word" xmlns:w="http://schemas.openxmlformats.org/wordprocessingml/2006/main" xmlns:w14="http://schemas.microsoft.com/office/word/2010/wordml" xmlns:w15="http://schemas.microsoft.com/office/word/2012/wordml" xmlns:w16cex="http://schemas.microsoft.com/office/word/2018/wordml/cex" xmlns:w16cid="http://schemas.microsoft.com/office/word/2016/wordml/cid" xmlns:w16="http://schemas.microsoft.com/office/word/2018/wordml" xmlns:w16du="http://schemas.microsoft.com/office/word/2023/wordml/word16du" xmlns:w16sdtdh="http://schemas.microsoft.com/office/word/2020/wordml/sdtdatahash" xmlns:w16sdtfl="http://schemas.microsoft.com/office/word/2024/wordml/sdtformatlock" xmlns:w16se="http://schemas.microsoft.com/office/word/2015/wordml/symex" xmlns:wpg="http://schemas.microsoft.com/office/word/2010/wordprocessingGroup" xmlns:wpi="http://schemas.microsoft.com/office/word/2010/wordprocessingInk" xmlns:wne="http://schemas.microsoft.com/office/word/2006/wordml" xmlns:wps="http://schemas.microsoft.com/office/word/2010/wordprocessingShape" mc:Ignorable="w14 w15 w16se w16cid w16 w16cex w16sdtdh w16sdtfl w16du wp14">
   <w:footnote w:type="separator" w:id="-1">
     <w:p>
       <w:pPr>
@@ -1179,7 +1162,7 @@
 </file>
 
 <file path=word/header1.xml><?xml version="1.0" encoding="utf-8"?>
-<w:hdr xmlns:wpc="http://schemas.microsoft.com/office/word/2010/wordprocessingCanvas" xmlns:cx="http://schemas.microsoft.com/office/drawing/2014/chartex" xmlns:cx1="http://schemas.microsoft.com/office/drawing/2015/9/8/chartex" xmlns:cx2="http://schemas.microsoft.com/office/drawing/2015/10/21/chartex" xmlns:cx3="http://schemas.microsoft.com/office/drawing/2016/5/9/chartex" xmlns:cx4="http://schemas.microsoft.com/office/drawing/2016/5/10/chartex" xmlns:cx5="http://schemas.microsoft.com/office/drawing/2016/5/11/chartex" xmlns:cx6="http://schemas.microsoft.com/office/drawing/2016/5/12/chartex" xmlns:cx7="http://schemas.microsoft.com/office/drawing/2016/5/13/chartex" xmlns:cx8="http://schemas.microsoft.com/office/drawing/2016/5/14/chartex" xmlns:mc="http://schemas.openxmlformats.org/markup-compatibility/2006" xmlns:aink="http://schemas.microsoft.com/office/drawing/2016/ink" xmlns:am3d="http://schemas.microsoft.com/office/drawing/2017/model3d" xmlns:o="urn:schemas-microsoft-com:office:office" xmlns:r="http://schemas.openxmlformats.org/officeDocument/2006/relationships" xmlns:m="http://schemas.openxmlformats.org/officeDocument/2006/math" xmlns:v="urn:schemas-microsoft-com:vml" xmlns:wp14="http://schemas.microsoft.com/office/word/2010/wordprocessingDrawing" xmlns:wp="http://schemas.openxmlformats.org/drawingml/2006/wordprocessingDrawing" xmlns:w10="urn:schemas-microsoft-com:office:word" xmlns:w="http://schemas.openxmlformats.org/wordprocessingml/2006/main" xmlns:w14="http://schemas.microsoft.com/office/word/2010/wordml" xmlns:w15="http://schemas.microsoft.com/office/word/2012/wordml" xmlns:w16cid="http://schemas.microsoft.com/office/word/2016/wordml/cid" xmlns:w16se="http://schemas.microsoft.com/office/word/2015/wordml/symex" xmlns:wpg="http://schemas.microsoft.com/office/word/2010/wordprocessingGroup" xmlns:wpi="http://schemas.microsoft.com/office/word/2010/wordprocessingInk" xmlns:wne="http://schemas.microsoft.com/office/word/2006/wordml" xmlns:wps="http://schemas.microsoft.com/office/word/2010/wordprocessingShape" mc:Ignorable="w14 w15 w16se w16cid wp14">
+<w:hdr xmlns:wpc="http://schemas.microsoft.com/office/word/2010/wordprocessingCanvas" xmlns:cx="http://schemas.microsoft.com/office/drawing/2014/chartex" xmlns:cx1="http://schemas.microsoft.com/office/drawing/2015/9/8/chartex" xmlns:cx2="http://schemas.microsoft.com/office/drawing/2015/10/21/chartex" xmlns:cx3="http://schemas.microsoft.com/office/drawing/2016/5/9/chartex" xmlns:cx4="http://schemas.microsoft.com/office/drawing/2016/5/10/chartex" xmlns:cx5="http://schemas.microsoft.com/office/drawing/2016/5/11/chartex" xmlns:cx6="http://schemas.microsoft.com/office/drawing/2016/5/12/chartex" xmlns:cx7="http://schemas.microsoft.com/office/drawing/2016/5/13/chartex" xmlns:cx8="http://schemas.microsoft.com/office/drawing/2016/5/14/chartex" xmlns:mc="http://schemas.openxmlformats.org/markup-compatibility/2006" xmlns:aink="http://schemas.microsoft.com/office/drawing/2016/ink" xmlns:am3d="http://schemas.microsoft.com/office/drawing/2017/model3d" xmlns:o="urn:schemas-microsoft-com:office:office" xmlns:oel="http://schemas.microsoft.com/office/2019/extlst" xmlns:r="http://schemas.openxmlformats.org/officeDocument/2006/relationships" xmlns:m="http://schemas.openxmlformats.org/officeDocument/2006/math" xmlns:v="urn:schemas-microsoft-com:vml" xmlns:wp14="http://schemas.microsoft.com/office/word/2010/wordprocessingDrawing" xmlns:wp="http://schemas.openxmlformats.org/drawingml/2006/wordprocessingDrawing" xmlns:w10="urn:schemas-microsoft-com:office:word" xmlns:w="http://schemas.openxmlformats.org/wordprocessingml/2006/main" xmlns:w14="http://schemas.microsoft.com/office/word/2010/wordml" xmlns:w15="http://schemas.microsoft.com/office/word/2012/wordml" xmlns:w16cex="http://schemas.microsoft.com/office/word/2018/wordml/cex" xmlns:w16cid="http://schemas.microsoft.com/office/word/2016/wordml/cid" xmlns:w16="http://schemas.microsoft.com/office/word/2018/wordml" xmlns:w16du="http://schemas.microsoft.com/office/word/2023/wordml/word16du" xmlns:w16sdtdh="http://schemas.microsoft.com/office/word/2020/wordml/sdtdatahash" xmlns:w16sdtfl="http://schemas.microsoft.com/office/word/2024/wordml/sdtformatlock" xmlns:w16se="http://schemas.microsoft.com/office/word/2015/wordml/symex" xmlns:wpg="http://schemas.microsoft.com/office/word/2010/wordprocessingGroup" xmlns:wpi="http://schemas.microsoft.com/office/word/2010/wordprocessingInk" xmlns:wne="http://schemas.microsoft.com/office/word/2006/wordml" xmlns:wps="http://schemas.microsoft.com/office/word/2010/wordprocessingShape" mc:Ignorable="w14 w15 w16se w16cid w16 w16cex w16sdtdh w16sdtfl w16du wp14">
   <w:p>
     <w:pPr>
       <w:pStyle w:val="Header"/>
@@ -1199,7 +1182,7 @@
 </file>
 
 <file path=word/numbering.xml><?xml version="1.0" encoding="utf-8"?>
-<w:numbering xmlns:wpc="http://schemas.microsoft.com/office/word/2010/wordprocessingCanvas" xmlns:cx="http://schemas.microsoft.com/office/drawing/2014/chartex" xmlns:cx1="http://schemas.microsoft.com/office/drawing/2015/9/8/chartex" xmlns:cx2="http://schemas.microsoft.com/office/drawing/2015/10/21/chartex" xmlns:cx3="http://schemas.microsoft.com/office/drawing/2016/5/9/chartex" xmlns:cx4="http://schemas.microsoft.com/office/drawing/2016/5/10/chartex" xmlns:cx5="http://schemas.microsoft.com/office/drawing/2016/5/11/chartex" xmlns:cx6="http://schemas.microsoft.com/office/drawing/2016/5/12/chartex" xmlns:cx7="http://schemas.microsoft.com/office/drawing/2016/5/13/chartex" xmlns:cx8="http://schemas.microsoft.com/office/drawing/2016/5/14/chartex" xmlns:mc="http://schemas.openxmlformats.org/markup-compatibility/2006" xmlns:aink="http://schemas.microsoft.com/office/drawing/2016/ink" xmlns:am3d="http://schemas.microsoft.com/office/drawing/2017/model3d" xmlns:o="urn:schemas-microsoft-com:office:office" xmlns:r="http://schemas.openxmlformats.org/officeDocument/2006/relationships" xmlns:m="http://schemas.openxmlformats.org/officeDocument/2006/math" xmlns:v="urn:schemas-microsoft-com:vml" xmlns:wp14="http://schemas.microsoft.com/office/word/2010/wordprocessingDrawing" xmlns:wp="http://schemas.openxmlformats.org/drawingml/2006/wordprocessingDrawing" xmlns:w10="urn:schemas-microsoft-com:office:word" xmlns:w="http://schemas.openxmlformats.org/wordprocessingml/2006/main" xmlns:w14="http://schemas.microsoft.com/office/word/2010/wordml" xmlns:w15="http://schemas.microsoft.com/office/word/2012/wordml" xmlns:w16cid="http://schemas.microsoft.com/office/word/2016/wordml/cid" xmlns:w16se="http://schemas.microsoft.com/office/word/2015/wordml/symex" xmlns:wpg="http://schemas.microsoft.com/office/word/2010/wordprocessingGroup" xmlns:wpi="http://schemas.microsoft.com/office/word/2010/wordprocessingInk" xmlns:wne="http://schemas.microsoft.com/office/word/2006/wordml" xmlns:wps="http://schemas.microsoft.com/office/word/2010/wordprocessingShape" mc:Ignorable="w14 w15 w16se w16cid wp14">
+<w:numbering xmlns:wpc="http://schemas.microsoft.com/office/word/2010/wordprocessingCanvas" xmlns:cx="http://schemas.microsoft.com/office/drawing/2014/chartex" xmlns:cx1="http://schemas.microsoft.com/office/drawing/2015/9/8/chartex" xmlns:cx2="http://schemas.microsoft.com/office/drawing/2015/10/21/chartex" xmlns:cx3="http://schemas.microsoft.com/office/drawing/2016/5/9/chartex" xmlns:cx4="http://schemas.microsoft.com/office/drawing/2016/5/10/chartex" xmlns:cx5="http://schemas.microsoft.com/office/drawing/2016/5/11/chartex" xmlns:cx6="http://schemas.microsoft.com/office/drawing/2016/5/12/chartex" xmlns:cx7="http://schemas.microsoft.com/office/drawing/2016/5/13/chartex" xmlns:cx8="http://schemas.microsoft.com/office/drawing/2016/5/14/chartex" xmlns:mc="http://schemas.openxmlformats.org/markup-compatibility/2006" xmlns:aink="http://schemas.microsoft.com/office/drawing/2016/ink" xmlns:am3d="http://schemas.microsoft.com/office/drawing/2017/model3d" xmlns:o="urn:schemas-microsoft-com:office:office" xmlns:oel="http://schemas.microsoft.com/office/2019/extlst" xmlns:r="http://schemas.openxmlformats.org/officeDocument/2006/relationships" xmlns:m="http://schemas.openxmlformats.org/officeDocument/2006/math" xmlns:v="urn:schemas-microsoft-com:vml" xmlns:wp14="http://schemas.microsoft.com/office/word/2010/wordprocessingDrawing" xmlns:wp="http://schemas.openxmlformats.org/drawingml/2006/wordprocessingDrawing" xmlns:w10="urn:schemas-microsoft-com:office:word" xmlns:w="http://schemas.openxmlformats.org/wordprocessingml/2006/main" xmlns:w14="http://schemas.microsoft.com/office/word/2010/wordml" xmlns:w15="http://schemas.microsoft.com/office/word/2012/wordml" xmlns:w16cex="http://schemas.microsoft.com/office/word/2018/wordml/cex" xmlns:w16cid="http://schemas.microsoft.com/office/word/2016/wordml/cid" xmlns:w16="http://schemas.microsoft.com/office/word/2018/wordml" xmlns:w16du="http://schemas.microsoft.com/office/word/2023/wordml/word16du" xmlns:w16sdtdh="http://schemas.microsoft.com/office/word/2020/wordml/sdtdatahash" xmlns:w16sdtfl="http://schemas.microsoft.com/office/word/2024/wordml/sdtformatlock" xmlns:w16se="http://schemas.microsoft.com/office/word/2015/wordml/symex" xmlns:wpg="http://schemas.microsoft.com/office/word/2010/wordprocessingGroup" xmlns:wpi="http://schemas.microsoft.com/office/word/2010/wordprocessingInk" xmlns:wne="http://schemas.microsoft.com/office/word/2006/wordml" xmlns:wps="http://schemas.microsoft.com/office/word/2010/wordprocessingShape" mc:Ignorable="w14 w15 w16se w16cid w16 w16cex w16sdtdh w16sdtfl w16du wp14">
   <w:abstractNum w:abstractNumId="0" w15:restartNumberingAfterBreak="0">
     <w:nsid w:val="051477A4"/>
     <w:multiLevelType w:val="hybridMultilevel"/>
@@ -1598,23 +1581,23 @@
       </w:pPr>
     </w:lvl>
   </w:abstractNum>
-  <w:num w:numId="1">
+  <w:num w:numId="1" w16cid:durableId="1498960113">
     <w:abstractNumId w:val="3"/>
   </w:num>
-  <w:num w:numId="2">
+  <w:num w:numId="2" w16cid:durableId="1054617809">
     <w:abstractNumId w:val="0"/>
   </w:num>
-  <w:num w:numId="3">
+  <w:num w:numId="3" w16cid:durableId="975332111">
     <w:abstractNumId w:val="2"/>
   </w:num>
-  <w:num w:numId="4">
+  <w:num w:numId="4" w16cid:durableId="850800474">
     <w:abstractNumId w:val="1"/>
   </w:num>
 </w:numbering>
 </file>
 
 <file path=word/styles.xml><?xml version="1.0" encoding="utf-8"?>
-<w:styles xmlns:mc="http://schemas.openxmlformats.org/markup-compatibility/2006" xmlns:r="http://schemas.openxmlformats.org/officeDocument/2006/relationships" xmlns:w="http://schemas.openxmlformats.org/wordprocessingml/2006/main" xmlns:w14="http://schemas.microsoft.com/office/word/2010/wordml" xmlns:w15="http://schemas.microsoft.com/office/word/2012/wordml" xmlns:w16cid="http://schemas.microsoft.com/office/word/2016/wordml/cid" xmlns:w16se="http://schemas.microsoft.com/office/word/2015/wordml/symex" mc:Ignorable="w14 w15 w16se w16cid">
+<w:styles xmlns:mc="http://schemas.openxmlformats.org/markup-compatibility/2006" xmlns:r="http://schemas.openxmlformats.org/officeDocument/2006/relationships" xmlns:w="http://schemas.openxmlformats.org/wordprocessingml/2006/main" xmlns:w14="http://schemas.microsoft.com/office/word/2010/wordml" xmlns:w15="http://schemas.microsoft.com/office/word/2012/wordml" xmlns:w16cex="http://schemas.microsoft.com/office/word/2018/wordml/cex" xmlns:w16cid="http://schemas.microsoft.com/office/word/2016/wordml/cid" xmlns:w16="http://schemas.microsoft.com/office/word/2018/wordml" xmlns:w16du="http://schemas.microsoft.com/office/word/2023/wordml/word16du" xmlns:w16sdtdh="http://schemas.microsoft.com/office/word/2020/wordml/sdtdatahash" xmlns:w16sdtfl="http://schemas.microsoft.com/office/word/2024/wordml/sdtformatlock" xmlns:w16se="http://schemas.microsoft.com/office/word/2015/wordml/symex" mc:Ignorable="w14 w15 w16se w16cid w16 w16cex w16sdtdh w16sdtfl w16du">
   <w:docDefaults>
     <w:rPrDefault>
       <w:rPr>
@@ -1630,7 +1613,7 @@
       </w:pPr>
     </w:pPrDefault>
   </w:docDefaults>
-  <w:latentStyles w:defLockedState="0" w:defUIPriority="99" w:defSemiHidden="0" w:defUnhideWhenUsed="0" w:defQFormat="0" w:count="375">
+  <w:latentStyles w:defLockedState="0" w:defUIPriority="99" w:defSemiHidden="0" w:defUnhideWhenUsed="0" w:defQFormat="0" w:count="376">
     <w:lsdException w:name="Normal" w:uiPriority="0" w:qFormat="1"/>
     <w:lsdException w:name="heading 1" w:uiPriority="9" w:qFormat="1"/>
     <w:lsdException w:name="heading 2" w:semiHidden="1" w:uiPriority="9" w:unhideWhenUsed="1" w:qFormat="1"/>
@@ -2006,6 +1989,7 @@
     <w:lsdException w:name="Smart Hyperlink" w:semiHidden="1" w:unhideWhenUsed="1"/>
     <w:lsdException w:name="Hashtag" w:semiHidden="1" w:unhideWhenUsed="1"/>
     <w:lsdException w:name="Unresolved Mention" w:semiHidden="1" w:unhideWhenUsed="1"/>
+    <w:lsdException w:name="Smart Link" w:semiHidden="1" w:unhideWhenUsed="1"/>
   </w:latentStyles>
   <w:style w:type="paragraph" w:default="1" w:styleId="Normal">
     <w:name w:val="Normal"/>
@@ -2335,6 +2319,18 @@
       <w:shd w:val="clear" w:color="auto" w:fill="E1DFDD"/>
     </w:rPr>
   </w:style>
+  <w:style w:type="character" w:styleId="FollowedHyperlink">
+    <w:name w:val="FollowedHyperlink"/>
+    <w:basedOn w:val="DefaultParagraphFont"/>
+    <w:uiPriority w:val="99"/>
+    <w:semiHidden/>
+    <w:unhideWhenUsed/>
+    <w:rsid w:val="00922F56"/>
+    <w:rPr>
+      <w:color w:val="954F72" w:themeColor="followedHyperlink"/>
+      <w:u w:val="single"/>
+    </w:rPr>
+  </w:style>
 </w:styles>
 </file>
 

</xml_diff>

<commit_message>
got the columns up
</commit_message>
<xml_diff>
--- a/Assigment 2/inft1206_assignment2.docx
+++ b/Assigment 2/inft1206_assignment2.docx
@@ -978,7 +978,25 @@
             <w:shd w:val="clear" w:color="auto" w:fill="FFFFFF"/>
           </w:rPr>
           <w:lastRenderedPageBreak/>
-          <w:t>US/docs/Learn/HTML/Multimedia_and_embedding/Mozilla_splash_page</w:t>
+          <w:t>US/docs/Learn/HTML/Mul</w:t>
+        </w:r>
+        <w:r>
+          <w:rPr>
+            <w:rStyle w:val="Hyperlink"/>
+            <w:rFonts w:ascii="Verdana" w:hAnsi="Verdana"/>
+            <w:sz w:val="22"/>
+            <w:shd w:val="clear" w:color="auto" w:fill="FFFFFF"/>
+          </w:rPr>
+          <w:t>t</w:t>
+        </w:r>
+        <w:r>
+          <w:rPr>
+            <w:rStyle w:val="Hyperlink"/>
+            <w:rFonts w:ascii="Verdana" w:hAnsi="Verdana"/>
+            <w:sz w:val="22"/>
+            <w:shd w:val="clear" w:color="auto" w:fill="FFFFFF"/>
+          </w:rPr>
+          <w:t>imedia_and_embedding/Mozilla_splash_page</w:t>
         </w:r>
       </w:hyperlink>
       <w:r>
@@ -1046,7 +1064,25 @@
             <w:sz w:val="22"/>
             <w:shd w:val="clear" w:color="auto" w:fill="FFFFFF"/>
           </w:rPr>
-          <w:t>https://developer.mozilla.org/en-US/docs/Learn/HTML/Tables/Structuring_planet_data</w:t>
+          <w:t>https://developer.mozilla.org/en-US/docs/Learn/HTML/Tab</w:t>
+        </w:r>
+        <w:r>
+          <w:rPr>
+            <w:rStyle w:val="Hyperlink"/>
+            <w:rFonts w:ascii="Verdana" w:hAnsi="Verdana"/>
+            <w:sz w:val="22"/>
+            <w:shd w:val="clear" w:color="auto" w:fill="FFFFFF"/>
+          </w:rPr>
+          <w:t>l</w:t>
+        </w:r>
+        <w:r>
+          <w:rPr>
+            <w:rStyle w:val="Hyperlink"/>
+            <w:rFonts w:ascii="Verdana" w:hAnsi="Verdana"/>
+            <w:sz w:val="22"/>
+            <w:shd w:val="clear" w:color="auto" w:fill="FFFFFF"/>
+          </w:rPr>
+          <w:t>es/Structuring_planet_data</w:t>
         </w:r>
       </w:hyperlink>
       <w:r>

</xml_diff>